<commit_message>
Sync Milestone 2 presentation script with latest instructor-aligned wording.
Updates only the speaker-script DOCX with corrected top-k (4/4/5), explicit RAG + Agentic AI, folder walkthrough, and <=25-minute demo guidance.
</commit_message>
<xml_diff>
--- a/Milestone2_Presentation_Script.docx
+++ b/Milestone2_Presentation_Script.docx
@@ -65,6 +65,14 @@
     </w:p>
     <w:p>
       <w:pPr>
+        <w:spacing w:after="160" w:before="0" w:line="276" w:lineRule="auto"/>
+      </w:pPr>
+      <w:r>
+        <w:t>Time budget (required): Presentation + Demo combined maximum = 25 minutes. Target about 16–19 minutes for slides and 4–5 minutes for the live demo. Prefer concise explanations on deep-dive figures; prioritize RAG, Agentic AI, stack, trade-offs, metrics, and live proof.</w:t>
+      </w:r>
+    </w:p>
+    <w:p>
+      <w:pPr>
         <w:pStyle w:val="Heading2"/>
       </w:pPr>
       <w:r>
@@ -89,7 +97,7 @@
           <w:i w:val="0"/>
           <w:sz w:val="22"/>
         </w:rPr>
-        <w:t>By the end of this talk, the audience should understand: (1) I built an end-to-end, runnable clinical evidence CDSS with RAG and LangGraph agents; (2) evidence is ranked by clinical priority, not semantic similarity alone; (3) yellow stack components are implemented today and green components are the ideal future architecture; (4) evaluation and a live demo prove the system works.</w:t>
+        <w:t>By the end of this talk, the audience should understand: (1) this project implements both major GenAI pillars from this course — Retrieval-Augmented Generation (RAG) and Agentic AI; (2) evidence is ranked by clinical priority, not semantic similarity alone; (3) yellow stack components are implemented today and green components are the ideal future architecture; (4) evaluation and a live demo prove the system works.</w:t>
       </w:r>
     </w:p>
     <w:p>
@@ -118,7 +126,7 @@
           <w:i/>
           <w:sz w:val="20"/>
         </w:rPr>
-        <w:t>Suggested timing: ~20–30 seconds</w:t>
+        <w:t>Suggested timing: ~20 seconds</w:t>
       </w:r>
     </w:p>
     <w:p>
@@ -160,7 +168,7 @@
           <w:i w:val="0"/>
           <w:sz w:val="22"/>
         </w:rPr>
-        <w:t>Milestone 1 was about the clinical problem and the persona. Milestone 2 is the engineering proof: a working end-to-end prototype that combines retrieval-augmented generation, LangGraph multi-agent orchestration, evidence-hierarchy ranking, and a clinician-facing Streamlit workspace.</w:t>
+        <w:t>Milestone 1 was about the clinical problem and the persona. Milestone 2 is the engineering proof: a working end-to-end prototype. This project implements both major GenAI pillars emphasized in this course: Retrieval-Augmented Generation (RAG) and Agentic AI. RAG is TF-IDF → FAISS → evidence hierarchy/reranking → grounded response → citation verification. Agentic AI is the 8-node LangGraph workflow. The clinician UI is Streamlit.</w:t>
       </w:r>
     </w:p>
     <w:p>
@@ -202,7 +210,7 @@
           <w:i/>
           <w:sz w:val="22"/>
         </w:rPr>
-        <w:t>I’ll start with what was actually built, then walk the architecture figures, the AI tech stack, trade-offs, evaluation, and a live demo.</w:t>
+        <w:t>I’ll start with what was actually built, then walk architecture, the AI tech stack, trade-offs, metrics, and a live demo that also walks the modular folder structure.</w:t>
       </w:r>
     </w:p>
     <w:p>
@@ -231,7 +239,7 @@
           <w:i/>
           <w:sz w:val="20"/>
         </w:rPr>
-        <w:t>Suggested timing: ~30–40 seconds</w:t>
+        <w:t>Suggested timing: ~25 seconds</w:t>
       </w:r>
     </w:p>
     <w:p>
@@ -329,7 +337,7 @@
           <w:i w:val="0"/>
           <w:sz w:val="22"/>
         </w:rPr>
-        <w:t>Fifth, data, insights, evaluation metrics, challenges, and then the live demo that proves the system runs.</w:t>
+        <w:t>Fifth, data, insights, evaluation metrics, challenges, then a live demo: folder walkthrough, Streamlit run, Agent Trace, metrics, and key source files.</w:t>
       </w:r>
     </w:p>
     <w:p>
@@ -386,7 +394,7 @@
           <w:i/>
           <w:sz w:val="20"/>
         </w:rPr>
-        <w:t>Suggested timing: ~1.5–2 minutes</w:t>
+        <w:t>Suggested timing: ~1 minute</w:t>
       </w:r>
     </w:p>
     <w:p>
@@ -428,7 +436,7 @@
           <w:i w:val="0"/>
           <w:sz w:val="22"/>
         </w:rPr>
-        <w:t>First: I built an end-to-end clinical decision-support prototype. The clinician UI is Streamlit. Behind it is a LangGraph StateGraph with eight nodes. The system produces source-linked recommendations with citations, a confidence score, and a human-review flag when evidence or patient data is weak.</w:t>
+        <w:t>First — Agentic AI: an end-to-end CDSS with Streamlit UI and a LangGraph StateGraph with eight nodes. It returns source-linked recommendations, citations, confidence, and a human-review flag when evidence or patient data is weak.</w:t>
       </w:r>
     </w:p>
     <w:p>
@@ -442,7 +450,7 @@
           <w:i w:val="0"/>
           <w:sz w:val="22"/>
         </w:rPr>
-        <w:t>Second: hierarchy-aware RAG over a public-style medical knowledge base. Vectors live in FAISS using IndexFlatIP. Embeddings default to local TF-IDF so the demo runs offline. Retrieved chunks are re-ranked by Priority 1 through 7 — guidelines first, MedQuAD last — and superseded guidelines are downgraded. If an OpenAI-compatible API key is present, the system can use a chat LLM; if not, it falls back to an extractive grounded summary from retrieved chunks. That offline path is a deliberate reliability decision.</w:t>
+        <w:t>Second — RAG: TF-IDF embeddings into FAISS IndexFlatIP, then Priority 1–7 evidence hierarchy/reranking (guidelines first; superseded guidelines downgraded), then a grounded response with citation verification. With an API key, an optional chat LLM can be used; otherwise the offline extractive fallback stays grounded in retrieved chunks.</w:t>
       </w:r>
     </w:p>
     <w:p>
@@ -527,7 +535,7 @@
           <w:i/>
           <w:sz w:val="20"/>
         </w:rPr>
-        <w:t>Suggested timing: ~1–1.5 minutes</w:t>
+        <w:t>Suggested timing: ~45 seconds</w:t>
       </w:r>
     </w:p>
     <w:p>
@@ -682,7 +690,7 @@
           <w:i/>
           <w:sz w:val="20"/>
         </w:rPr>
-        <w:t>Suggested timing: ~1.5–2 minutes</w:t>
+        <w:t>Suggested timing: ~1 minute</w:t>
       </w:r>
     </w:p>
     <w:p>
@@ -865,7 +873,7 @@
           <w:i/>
           <w:sz w:val="20"/>
         </w:rPr>
-        <w:t>Suggested timing: ~1.5–2 minutes</w:t>
+        <w:t>Suggested timing: ~1 minute</w:t>
       </w:r>
     </w:p>
     <w:p>
@@ -949,7 +957,7 @@
           <w:i w:val="0"/>
           <w:sz w:val="22"/>
         </w:rPr>
-        <w:t>Why LangGraph instead of one giant function? Clear agent boundaries make the CDSS steps visible in the demo, produce an audit trail, and match the course emphasis on agentic AI. The trade-off is slightly more code than a single RAG call — and that trade-off is intentional for clarity and grading.</w:t>
+        <w:t>Why LangGraph? Clear agent boundaries make CDSS steps demoable, produce an audit trail, and prove Agentic AI. Slightly more code than one RAG call — intentional for clarity and grading.</w:t>
       </w:r>
     </w:p>
     <w:p>
@@ -1006,7 +1014,7 @@
           <w:i/>
           <w:sz w:val="20"/>
         </w:rPr>
-        <w:t>Suggested timing: ~1.5–2 minutes</w:t>
+        <w:t>Suggested timing: ~1 minute</w:t>
       </w:r>
     </w:p>
     <w:p>
@@ -1189,7 +1197,7 @@
           <w:i/>
           <w:sz w:val="20"/>
         </w:rPr>
-        <w:t>Suggested timing: ~1.5–2 minutes</w:t>
+        <w:t>Suggested timing: ~1 minute</w:t>
       </w:r>
     </w:p>
     <w:p>
@@ -1273,7 +1281,7 @@
           <w:i w:val="0"/>
           <w:sz w:val="22"/>
         </w:rPr>
-        <w:t>Why RAG here? A plain LLM can invent guidelines. Retrieval-first plus citation checks reduce unsupported claims. That’s the core safety and trust argument for this project.</w:t>
+        <w:t>Why RAG? A plain LLM can invent guidelines. Retrieve-first plus citation checks reduce unsupported claims — the core trust argument.</w:t>
       </w:r>
     </w:p>
     <w:p>
@@ -1330,7 +1338,7 @@
           <w:i/>
           <w:sz w:val="20"/>
         </w:rPr>
-        <w:t>Suggested timing: ~1.5 minutes</w:t>
+        <w:t>Suggested timing: ~45 seconds</w:t>
       </w:r>
     </w:p>
     <w:p>
@@ -1527,7 +1535,7 @@
           <w:i/>
           <w:sz w:val="20"/>
         </w:rPr>
-        <w:t>Suggested timing: ~1.5 minutes</w:t>
+        <w:t>Suggested timing: ~45 seconds</w:t>
       </w:r>
     </w:p>
     <w:p>
@@ -1710,7 +1718,7 @@
           <w:i/>
           <w:sz w:val="20"/>
         </w:rPr>
-        <w:t>Suggested timing: ~1–1.5 minutes</w:t>
+        <w:t>Suggested timing: ~45 seconds</w:t>
       </w:r>
     </w:p>
     <w:p>
@@ -1837,7 +1845,7 @@
           <w:i/>
           <w:sz w:val="20"/>
         </w:rPr>
-        <w:t>Suggested timing: ~1.5 minutes</w:t>
+        <w:t>Suggested timing: ~45 seconds</w:t>
       </w:r>
     </w:p>
     <w:p>
@@ -1978,7 +1986,7 @@
           <w:i/>
           <w:sz w:val="20"/>
         </w:rPr>
-        <w:t>Suggested timing: ~1–1.5 minutes</w:t>
+        <w:t>Suggested timing: ~45 seconds</w:t>
       </w:r>
     </w:p>
     <w:p>
@@ -2091,7 +2099,7 @@
           <w:i/>
           <w:sz w:val="20"/>
         </w:rPr>
-        <w:t>Suggested timing: ~2–2.5 minutes</w:t>
+        <w:t>Suggested timing: ~1.5 minutes</w:t>
       </w:r>
     </w:p>
     <w:p>
@@ -2246,7 +2254,7 @@
           <w:i/>
           <w:sz w:val="20"/>
         </w:rPr>
-        <w:t>Suggested timing: ~2 minutes</w:t>
+        <w:t>Suggested timing: ~1 minute</w:t>
       </w:r>
     </w:p>
     <w:p>
@@ -2429,7 +2437,7 @@
           <w:i/>
           <w:sz w:val="20"/>
         </w:rPr>
-        <w:t>Suggested timing: ~1.5 minutes</w:t>
+        <w:t>Suggested timing: ~45 seconds</w:t>
       </w:r>
     </w:p>
     <w:p>
@@ -2542,7 +2550,7 @@
           <w:i/>
           <w:sz w:val="20"/>
         </w:rPr>
-        <w:t>Suggested timing: ~1.5–2 minutes</w:t>
+        <w:t>Suggested timing: ~1 minute</w:t>
       </w:r>
     </w:p>
     <w:p>
@@ -2598,7 +2606,7 @@
           <w:i w:val="0"/>
           <w:sz w:val="22"/>
         </w:rPr>
-        <w:t>Chunks per query: 5 after priority re-rank top-k.</w:t>
+        <w:t>Configured top-k = 5; evaluated queries returned 4–5 chunks (actual eval counts: 4, 4, and 5).</w:t>
       </w:r>
     </w:p>
     <w:p>
@@ -2697,7 +2705,7 @@
           <w:i/>
           <w:sz w:val="20"/>
         </w:rPr>
-        <w:t>Suggested timing: ~1–1.5 minutes</w:t>
+        <w:t>Suggested timing: ~45 seconds</w:t>
       </w:r>
     </w:p>
     <w:p>
@@ -2725,7 +2733,7 @@
           <w:i w:val="0"/>
           <w:sz w:val="22"/>
         </w:rPr>
-        <w:t>Challenges: heavy embedding stacks broke local installs, so I defaulted to offline TF-IDF. Pure semantic search overweighted patient-education pages. Superseded guidelines still retrieved unless ranking penalized them. The UI had to become clinician-readable without rewriting agents. I had to label indexed or cached evidence honestly versus true live retrieval. And medical prototypes need loud disclaimers and review flags.</w:t>
+        <w:t>Challenges: heavy embedding stacks broke local installs → offline TF-IDF; pure semantic search overweighted education pages; superseded guidelines needed ranking penalties; UI had to stay clinician-readable; indexed/cached evidence must be labeled honestly; medical prototypes need disclaimers and review flags.</w:t>
       </w:r>
     </w:p>
     <w:p>
@@ -2739,7 +2747,7 @@
           <w:i w:val="0"/>
           <w:sz w:val="22"/>
         </w:rPr>
-        <w:t>Learnings: separate implemented versus ideal stack explicitly. Evidence hierarchy plus citation checks beat fluency-only answers. LangGraph boundaries make CDSS steps demoable and debuggable. Local-first design improves reliability and lowers cost. Trade-offs are the product story — cost, latency, scale, maintainability. And clinician support is not clinician replacement; transparency builds trust.</w:t>
+        <w:t>Learnings: separate implemented vs ideal explicitly; hierarchy + citations beat fluency-only answers; LangGraph makes agents demoable; local-first improves reliability/cost; trade-offs (cost/latency/scale) are the product story; support ≠ replacement.</w:t>
       </w:r>
     </w:p>
     <w:p>
@@ -2767,7 +2775,7 @@
           <w:i/>
           <w:sz w:val="22"/>
         </w:rPr>
-        <w:t>Now the proof — live demo with camera on, walking the running system and the codebase.</w:t>
+        <w:t>Now the proof — live demo with cameras on: folder structure first, then the running app, then key source files.</w:t>
       </w:r>
     </w:p>
     <w:p>
@@ -2796,7 +2804,7 @@
           <w:i/>
           <w:sz w:val="20"/>
         </w:rPr>
-        <w:t>Suggested timing: ~3–5 minutes (demo time)</w:t>
+        <w:t>Suggested timing: ~4–5 minutes (demo time; keep total presentation+demo ≤25 minutes)</w:t>
       </w:r>
     </w:p>
     <w:p>
@@ -2824,7 +2832,7 @@
           <w:i w:val="0"/>
           <w:sz w:val="22"/>
         </w:rPr>
-        <w:t>For the recording: camera on.</w:t>
+        <w:t>For the recording: camera ON for every presenter. All team members present. Presentation + Demo combined ≤25 minutes. Audio-only voiceover is not acceptable.</w:t>
       </w:r>
     </w:p>
     <w:p>
@@ -2838,7 +2846,15 @@
           <w:i w:val="0"/>
           <w:sz w:val="22"/>
         </w:rPr>
-        <w:t>Demo path: from AI HEALTH CARE, build the index if needed, then streamlit run app.py — or START_DEMO.bat.</w:t>
+        <w:t>Demo path: from AI HEALTH CARE, build the index if needed, then streamlit run app.py — or START_DEMO.bat. Keep this demo to about 4–5 minutes.</w:t>
+      </w:r>
+    </w:p>
+    <w:p>
+      <w:pPr>
+        <w:spacing w:after="160" w:before="0" w:line="276" w:lineRule="auto"/>
+      </w:pPr>
+      <w:r>
+        <w:t>Folder-structure walkthrough (~30–60 seconds) — show the modular GitHub/project layout: src/ (core RAG + agent modules), scripts/ (index build, evaluate, utilities), api/ (optional FastAPI), data/ (seed medical KB / registries), indexes/ (FAISS index + chunks), outputs/ (eval_results.json and run artifacts), app.py (Streamlit entrypoint), requirements.txt, and README.md. This modular layout is intentional so each GenAI pillar is inspectable.</w:t>
       </w:r>
     </w:p>
     <w:p>
@@ -2852,7 +2868,7 @@
           <w:i w:val="0"/>
           <w:sz w:val="22"/>
         </w:rPr>
-        <w:t>I’ll enter patient fields and a clinical question — for example ASCVD statin intensity or A1C target.</w:t>
+        <w:t>Then open the Streamlit app. Enter patient information and a clinical question — for example ASCVD statin intensity or A1C target.</w:t>
       </w:r>
     </w:p>
     <w:p>
@@ -2866,7 +2882,7 @@
           <w:i w:val="0"/>
           <w:sz w:val="22"/>
         </w:rPr>
-        <w:t>I’ll run the CDSS workflow and show KPIs, assessment, risk, evidence tiles with guidelines first, verification, recommendations, citations, agent trace, and confidence.</w:t>
+        <w:t>Run the workflow and show, in order: assessment/risk → retrieved evidence (guidelines first) → citations → recommendation → confidence / human-review flag → Agent Trace → metrics panel.</w:t>
       </w:r>
     </w:p>
     <w:p>
@@ -2880,7 +2896,7 @@
           <w:i w:val="0"/>
           <w:sz w:val="22"/>
         </w:rPr>
-        <w:t>I’ll point to Knowledge Update and Rebuild index as maintenance actions.</w:t>
+        <w:t>Optionally point to Knowledge Update / Rebuild index as maintenance actions — keep this brief.</w:t>
       </w:r>
     </w:p>
     <w:p>
@@ -2894,7 +2910,7 @@
           <w:i w:val="0"/>
           <w:sz w:val="22"/>
         </w:rPr>
-        <w:t>I’ll briefly show the codebase — graph.py, evidence_rank.py, vectorstore.py — so it’s clear this isn’t slides-only.</w:t>
+        <w:t>Finally, briefly open the key proof files: src/graph.py (Agentic AI / LangGraph), src/vectorstore.py (FAISS retrieval / RAG), src/evidence_rank.py (evidence hierarchy/reranking), and outputs/eval_results.json (metrics proof).</w:t>
       </w:r>
     </w:p>
     <w:p>
@@ -2908,7 +2924,7 @@
           <w:i w:val="0"/>
           <w:sz w:val="22"/>
         </w:rPr>
-        <w:t>Honesty check while demoing: implemented are Streamlit, LangGraph CDSS graph, FAISS, TF-IDF, priority ranking, citations, optional FastAPI, and knowledge-update probes. Not done: managed vector DB, neural embeddings plus re-ranker, HIPAA cloud, React app, full PMC or EHR.</w:t>
+        <w:t>Honesty check while demoing: Yellow/implemented = Streamlit, 8-node LangGraph, FAISS+TF-IDF RAG, priority ranking, citations, optional FastAPI, knowledge-update probes. Green/ideal/future = managed vector DB, neural embeddings + re-ranker, HIPAA cloud, React app, full PMC/EHR — do not claim those as implemented.</w:t>
       </w:r>
     </w:p>
     <w:p>
@@ -2979,7 +2995,7 @@
           <w:i/>
           <w:sz w:val="20"/>
         </w:rPr>
-        <w:t>Suggested timing: ~30–45 seconds</w:t>
+        <w:t>Suggested timing: ~30 seconds</w:t>
       </w:r>
     </w:p>
     <w:p>
@@ -3021,7 +3037,7 @@
           <w:i w:val="0"/>
           <w:sz w:val="22"/>
         </w:rPr>
-        <w:t>This Milestone 2 system demonstrates AI engineering for that goal: RAG, agents, ranking, and transparency — implemented, measured, and demoable.</w:t>
+        <w:t>This Milestone 2 system demonstrates both course GenAI pillars — RAG and Agentic AI — plus ranking, transparency, modular code, and measured citation precision — implemented and demoable.</w:t>
       </w:r>
     </w:p>
     <w:p>
@@ -3219,7 +3235,7 @@
           <w:i w:val="0"/>
           <w:sz w:val="22"/>
         </w:rPr>
-        <w:t>• Camera ON for all presenters.</w:t>
+        <w:t>• Camera ON for all presenters (required). Audio-only voiceover is not acceptable.</w:t>
       </w:r>
     </w:p>
     <w:p>
@@ -3275,7 +3291,7 @@
           <w:i w:val="0"/>
           <w:sz w:val="22"/>
         </w:rPr>
-        <w:t>• When showing the tech stack, explicitly say yellow vs green.</w:t>
+        <w:t>• When showing the tech stack, explicitly say: Yellow = Implemented; Green = Ideal/Future.</w:t>
       </w:r>
     </w:p>
     <w:p>
@@ -3289,7 +3305,7 @@
           <w:i w:val="0"/>
           <w:sz w:val="22"/>
         </w:rPr>
-        <w:t>• Do not claim green-cell components as finished.</w:t>
+        <w:t>• Do not claim green-cell / ideal components as implemented.</w:t>
       </w:r>
     </w:p>
     <w:p>
@@ -3303,7 +3319,23 @@
           <w:i w:val="0"/>
           <w:sz w:val="22"/>
         </w:rPr>
-        <w:t>• End with questions.</w:t>
+        <w:t>• Presentation + Demo combined ≤25 minutes (target ~17–19 min talk + ~4–5 min demo). All team members must present. End with questions.</w:t>
+      </w:r>
+    </w:p>
+    <w:p>
+      <w:pPr>
+        <w:spacing w:after="80" w:before="0" w:line="276" w:lineRule="auto"/>
+      </w:pPr>
+      <w:r>
+        <w:t>• Explicitly say early: this project implements RAG and Agentic AI.</w:t>
+      </w:r>
+    </w:p>
+    <w:p>
+      <w:pPr>
+        <w:spacing w:after="80" w:before="0" w:line="276" w:lineRule="auto"/>
+      </w:pPr>
+      <w:r>
+        <w:t>• Demo must show: folder structure → Streamlit → patient + question → workflow → evidence/citations/recommendation/confidence → Agent Trace → metrics → graph.py / vectorstore.py / evidence_rank.py.</w:t>
       </w:r>
     </w:p>
     <w:sectPr>

</xml_diff>